<commit_message>
Drop the confusion-matrix section from the results report
Removes §2.3 and its four figure blocks (40 embedded images), leaving
37 figures and 136 images. Subsections shift up: physical consistency to
2.3, loss curves to 2.4, feature importance to 2.5, model commentary to
2.6, and every cross-reference in both reports was updated to match.

The charts themselves are still generated and still committed; they are
simply no longer embedded in the report.

Also cleaned up what the removal orphaned: the _esik_ozeti() helper,
which only served that section, and the info report's confusion-matrix
glossary entry, which described something the reports no longer show.
The quartile entry stays but is now written in general statistical terms,
since the median still appears in MedianAE and the epoch statistics.
</commit_message>
<xml_diff>
--- a/MOF_Radyoaktif_Gaz_Adsorpsiyonu_Bilgi_RAPORU.docx
+++ b/MOF_Radyoaktif_Gaz_Adsorpsiyonu_Bilgi_RAPORU.docx
@@ -778,7 +778,7 @@
           <w:b w:val="0"/>
           <w:sz w:val="19"/>
         </w:rPr>
-        <w:t>DÖNGÜSELLİK: bu formülün girdileri olan PLD, Vₚ, OMS ve FG değişkenlerinin DÖRDÜ DE modele yardımcı (aux) GİRDİ özelliği olarak verilmektedir (bkz. §1.3). Dolayısıyla model, kendi girdilerinden hesaplanan bir formülü geri çözmeyi öğrenmektedir; R² tavanı fiziksel öğrenme kapasitesiyle değil, etikete enjekte edilen gürültüyle belirlenir. Bunun sonuçlardaki izleri Sonuç Raporu'nda §2.6'da (gözeneklilik grubunun permütasyon öneminin 3B yapıdan onlarca kat büyük çıkması) ve §2.4'te (modelin ürettiği korelasyonun gürültülü gerçek etiketlerinkinden daha güçlü olması) görülebilir. Bu nedenle raporlanan başarım değerleri boru hattının teknik doğrulamasıdır; gerçek Xe/Kr/I₂ adsorpsiyon tahmin yeteneği olarak sunulamaz.</w:t>
+        <w:t>DÖNGÜSELLİK: bu formülün girdileri olan PLD, Vₚ, OMS ve FG değişkenlerinin DÖRDÜ DE modele yardımcı (aux) GİRDİ özelliği olarak verilmektedir (bkz. §1.3). Dolayısıyla model, kendi girdilerinden hesaplanan bir formülü geri çözmeyi öğrenmektedir; R² tavanı fiziksel öğrenme kapasitesiyle değil, etikete enjekte edilen gürültüyle belirlenir. Bunun sonuçlardaki izleri Sonuç Raporu'nda §2.5'te (gözeneklilik grubunun permütasyon öneminin 3B yapıdan onlarca kat büyük çıkması) ve §2.3'te (modelin ürettiği korelasyonun gürültülü gerçek etiketlerinkinden daha güçlü olması) görülebilir. Bu nedenle raporlanan başarım değerleri boru hattının teknik doğrulamasıdır; gerçek Xe/Kr/I₂ adsorpsiyon tahmin yeteneği olarak sunulamaz.</w:t>
       </w:r>
     </w:p>
     <w:p/>
@@ -4215,7 +4215,7 @@
                 <w:b w:val="0"/>
                 <w:sz w:val="18"/>
               </w:rPr>
-              <w:t>Sonuç Raporu §2.5'teki kayıp eğrilerinde, validasyon (kesikli) çizgisinin en alçak noktası o fold'un seçilen epoch'udur. Bu noktadan sonra validasyon çizgisi yükselirken eğitim çizgisi düşmeye devam ediyorsa, orası ezberin başladığı yerdir</w:t>
+              <w:t>Sonuç Raporu §2.4'teki kayıp eğrilerinde, validasyon (kesikli) çizgisinin en alçak noktası o fold'un seçilen epoch'udur. Bu noktadan sonra validasyon çizgisi yükselirken eğitim çizgisi düşmeye devam ediyorsa, orası ezberin başladığı yerdir</w:t>
             </w:r>
           </w:p>
         </w:tc>
@@ -11320,28 +11320,13 @@
           <w:b/>
           <w:sz w:val="18"/>
         </w:rPr>
-        <w:t xml:space="preserve">Karışıklık matrisi (confusion matrix): </w:t>
-      </w:r>
-      <w:r>
-        <w:rPr>
-          <w:sz w:val="18"/>
-        </w:rPr>
-        <w:t>Normalde sınıflandırma için kullanılır; burada regresyon çıktısı yorumlanabilirlik için 4 sınıfa indirgenmiştir. Satırlar gerçek, sütunlar tahmin edilen sınıftır; KÖŞEGEN üzerindeki hücreler doğru sınıflandırmalardır.</w:t>
-      </w:r>
-    </w:p>
-    <w:p>
-      <w:r>
-        <w:rPr>
-          <w:b/>
-          <w:sz w:val="18"/>
-        </w:rPr>
         <w:t xml:space="preserve">Çeyreklik (Q1 / medyan / Q3): </w:t>
       </w:r>
       <w:r>
         <w:rPr>
           <w:sz w:val="18"/>
         </w:rPr>
-        <w:t>Veriyi dörde bölen noktalar: Q1'in altında verinin %25'i, medyanın altında %50'si, Q3'ün altında %75'i kalır. Sınıf sınırları sabit fiziksel eşik yerine bu noktalardan belirlenir — yani sınıflar 'düşük/orta-düşük/orta-yüksek/yüksek' GÖRELİ sınıflardır.</w:t>
+        <w:t>Veriyi dörde bölen noktalar: Q1'in altında verinin %25'i, medyanın altında %50'si, Q3'ün altında %75'i kalır. Medyan, birkaç aşırı değerden etkilenmediği için ortalamadan daha dayanıklı bir 'tipik değer' ölçüsüdür; raporda MedianAE metriğinde ve seçilen epoch istatistiklerinde kullanılır.</w:t>
       </w:r>
     </w:p>
     <w:p>

</xml_diff>